<commit_message>
⚡ Bolt: Performance boost for DocxExportService
- Used IsMatch fast path before falling back to Split
- Fixes significant array allocations during text element processing.
</commit_message>
<xml_diff>
--- a/test_outputs/sample_tabs.docx
+++ b/test_outputs/sample_tabs.docx
@@ -361,8 +361,8 @@
       </w:r>
     </w:p>
     <w:sectPr>
-      <w:headerReference xmlns:r="http://schemas.openxmlformats.org/officeDocument/2006/relationships" w:type="default" r:id="R0af708a9e68c45db"/>
-      <w:footerReference xmlns:r="http://schemas.openxmlformats.org/officeDocument/2006/relationships" w:type="default" r:id="R1ac73e897a974ef8"/>
+      <w:headerReference xmlns:r="http://schemas.openxmlformats.org/officeDocument/2006/relationships" w:type="default" r:id="Rf9e414318ae748cf"/>
+      <w:footerReference xmlns:r="http://schemas.openxmlformats.org/officeDocument/2006/relationships" w:type="default" r:id="Rdb435eefcee34227"/>
       <w:pgSz w:w="11906" w:h="16838"/>
       <w:pgMar w:top="1440" w:right="1440" w:bottom="1440" w:left="1440" w:header="576" w:footer="576" w:gutter="0"/>
       <w:pgBorders w:display="allPages" w:offsetFrom="page">

</xml_diff>